<commit_message>
feat: integrate farm frontend backend and AI assistant
</commit_message>
<xml_diff>
--- a/docs/architecture/基本功能-数据库表.docx
+++ b/docs/architecture/基本功能-数据库表.docx
@@ -6994,6 +6994,26 @@
           <w:lang w:eastAsia="zh-CN"/>
         </w:rPr>
       </w:pPr>
+      <w:r>
+        <w:rPr>
+          <w:rFonts w:hint="eastAsia"/>
+          <w:lang w:eastAsia="zh-CN"/>
+        </w:rPr>
+        <w:t>后端返回前端的时间统一带上Z</w:t>
+      </w:r>
+    </w:p>
+    <w:p>
+      <w:pPr>
+        <w:rPr>
+          <w:lang w:eastAsia="zh-CN"/>
+        </w:rPr>
+      </w:pPr>
+      <w:r>
+        <w:rPr>
+          <w:lang w:eastAsia="zh-CN"/>
+        </w:rPr>
+        <w:t>前端应在展示时将 API 返回的 UTC 时间转换为 Asia/Shanghai，不要修改 API 原始时间值。</w:t>
+      </w:r>
     </w:p>
     <w:sectPr>
       <w:pgSz w:w="12240" w:h="15840"/>

</xml_diff>

<commit_message>
feat: localize demo data and improve alert handling
</commit_message>
<xml_diff>
--- a/docs/architecture/基本功能-数据库表.docx
+++ b/docs/architecture/基本功能-数据库表.docx
@@ -7014,6 +7014,417 @@
         </w:rPr>
         <w:t>前端应在展示时将 API 返回的 UTC 时间转换为 Asia/Shanghai，不要修改 API 原始时间值。</w:t>
       </w:r>
+    </w:p>
+    <w:p>
+      <w:pPr>
+        <w:rPr>
+          <w:lang w:eastAsia="zh-CN"/>
+        </w:rPr>
+      </w:pPr>
+    </w:p>
+    <w:tbl>
+      <w:tblPr>
+        <w:tblStyle w:val="aff1"/>
+        <w:tblW w:w="0" w:type="auto"/>
+        <w:tblLook w:val="04A0" w:firstRow="1" w:lastRow="0" w:firstColumn="1" w:lastColumn="0" w:noHBand="0" w:noVBand="1"/>
+      </w:tblPr>
+      <w:tblGrid>
+        <w:gridCol w:w="1852"/>
+        <w:gridCol w:w="6513"/>
+        <w:gridCol w:w="1643"/>
+      </w:tblGrid>
+      <w:tr>
+        <w:tc>
+          <w:tcPr>
+            <w:tcW w:w="0" w:type="auto"/>
+            <w:hideMark/>
+          </w:tcPr>
+          <w:p>
+            <w:pPr>
+              <w:spacing w:after="200" w:line="276" w:lineRule="auto"/>
+              <w:rPr>
+                <w:b/>
+                <w:bCs/>
+                <w:lang w:eastAsia="zh-CN"/>
+              </w:rPr>
+            </w:pPr>
+            <w:r>
+              <w:rPr>
+                <w:b/>
+                <w:bCs/>
+                <w:lang w:eastAsia="zh-CN"/>
+              </w:rPr>
+              <w:t>问题</w:t>
+            </w:r>
+          </w:p>
+        </w:tc>
+        <w:tc>
+          <w:tcPr>
+            <w:tcW w:w="0" w:type="auto"/>
+            <w:hideMark/>
+          </w:tcPr>
+          <w:p>
+            <w:pPr>
+              <w:spacing w:after="200" w:line="276" w:lineRule="auto"/>
+              <w:rPr>
+                <w:b/>
+                <w:bCs/>
+                <w:lang w:eastAsia="zh-CN"/>
+              </w:rPr>
+            </w:pPr>
+            <w:r>
+              <w:rPr>
+                <w:b/>
+                <w:bCs/>
+                <w:lang w:eastAsia="zh-CN"/>
+              </w:rPr>
+              <w:t>推荐处理</w:t>
+            </w:r>
+          </w:p>
+        </w:tc>
+        <w:tc>
+          <w:tcPr>
+            <w:tcW w:w="0" w:type="auto"/>
+            <w:hideMark/>
+          </w:tcPr>
+          <w:p>
+            <w:pPr>
+              <w:spacing w:after="200" w:line="276" w:lineRule="auto"/>
+              <w:rPr>
+                <w:b/>
+                <w:bCs/>
+                <w:lang w:eastAsia="zh-CN"/>
+              </w:rPr>
+            </w:pPr>
+            <w:r>
+              <w:rPr>
+                <w:b/>
+                <w:bCs/>
+                <w:lang w:eastAsia="zh-CN"/>
+              </w:rPr>
+              <w:t>是否改数据库</w:t>
+            </w:r>
+          </w:p>
+        </w:tc>
+      </w:tr>
+      <w:tr>
+        <w:tc>
+          <w:tcPr>
+            <w:tcW w:w="0" w:type="auto"/>
+            <w:hideMark/>
+          </w:tcPr>
+          <w:p>
+            <w:pPr>
+              <w:spacing w:after="200" w:line="276" w:lineRule="auto"/>
+              <w:rPr>
+                <w:lang w:eastAsia="zh-CN"/>
+              </w:rPr>
+            </w:pPr>
+            <w:r>
+              <w:rPr>
+                <w:lang w:eastAsia="zh-CN"/>
+              </w:rPr>
+              <w:t>用户名</w:t>
+            </w:r>
+          </w:p>
+        </w:tc>
+        <w:tc>
+          <w:tcPr>
+            <w:tcW w:w="0" w:type="auto"/>
+            <w:hideMark/>
+          </w:tcPr>
+          <w:p>
+            <w:pPr>
+              <w:spacing w:after="200" w:line="276" w:lineRule="auto"/>
+              <w:rPr>
+                <w:lang w:eastAsia="zh-CN"/>
+              </w:rPr>
+            </w:pPr>
+            <w:r>
+              <w:rPr>
+                <w:lang w:eastAsia="zh-CN"/>
+              </w:rPr>
+              <w:t>保留 demo_farmer 这类登录账号，新增或补齐中文 real_name，页面优先展示姓名</w:t>
+            </w:r>
+          </w:p>
+        </w:tc>
+        <w:tc>
+          <w:tcPr>
+            <w:tcW w:w="0" w:type="auto"/>
+            <w:hideMark/>
+          </w:tcPr>
+          <w:p>
+            <w:pPr>
+              <w:spacing w:after="200" w:line="276" w:lineRule="auto"/>
+              <w:rPr>
+                <w:lang w:eastAsia="zh-CN"/>
+              </w:rPr>
+            </w:pPr>
+            <w:r>
+              <w:rPr>
+                <w:lang w:eastAsia="zh-CN"/>
+              </w:rPr>
+              <w:t>仅更新演示数据</w:t>
+            </w:r>
+          </w:p>
+        </w:tc>
+      </w:tr>
+      <w:tr>
+        <w:tc>
+          <w:tcPr>
+            <w:tcW w:w="0" w:type="auto"/>
+            <w:hideMark/>
+          </w:tcPr>
+          <w:p>
+            <w:pPr>
+              <w:spacing w:after="200" w:line="276" w:lineRule="auto"/>
+              <w:rPr>
+                <w:lang w:eastAsia="zh-CN"/>
+              </w:rPr>
+            </w:pPr>
+            <w:r>
+              <w:rPr>
+                <w:lang w:eastAsia="zh-CN"/>
+              </w:rPr>
+              <w:t>农场、地块、作物、地址</w:t>
+            </w:r>
+          </w:p>
+        </w:tc>
+        <w:tc>
+          <w:tcPr>
+            <w:tcW w:w="0" w:type="auto"/>
+            <w:hideMark/>
+          </w:tcPr>
+          <w:p>
+            <w:pPr>
+              <w:spacing w:after="200" w:line="276" w:lineRule="auto"/>
+              <w:rPr>
+                <w:lang w:eastAsia="zh-CN"/>
+              </w:rPr>
+            </w:pPr>
+            <w:r>
+              <w:rPr>
+                <w:lang w:eastAsia="zh-CN"/>
+              </w:rPr>
+              <w:t>直接把演示数据改为中文，例如“杭州智慧农场”“一号温室”“番茄”</w:t>
+            </w:r>
+          </w:p>
+        </w:tc>
+        <w:tc>
+          <w:tcPr>
+            <w:tcW w:w="0" w:type="auto"/>
+            <w:hideMark/>
+          </w:tcPr>
+          <w:p>
+            <w:pPr>
+              <w:spacing w:after="200" w:line="276" w:lineRule="auto"/>
+              <w:rPr>
+                <w:lang w:eastAsia="zh-CN"/>
+              </w:rPr>
+            </w:pPr>
+            <w:r>
+              <w:rPr>
+                <w:lang w:eastAsia="zh-CN"/>
+              </w:rPr>
+              <w:t>更新演示数据和现有库</w:t>
+            </w:r>
+          </w:p>
+        </w:tc>
+      </w:tr>
+      <w:tr>
+        <w:tc>
+          <w:tcPr>
+            <w:tcW w:w="0" w:type="auto"/>
+            <w:hideMark/>
+          </w:tcPr>
+          <w:p>
+            <w:pPr>
+              <w:spacing w:after="200" w:line="276" w:lineRule="auto"/>
+              <w:rPr>
+                <w:lang w:eastAsia="zh-CN"/>
+              </w:rPr>
+            </w:pPr>
+            <w:r>
+              <w:rPr>
+                <w:lang w:eastAsia="zh-CN"/>
+              </w:rPr>
+              <w:t>告警类型筛选</w:t>
+            </w:r>
+          </w:p>
+        </w:tc>
+        <w:tc>
+          <w:tcPr>
+            <w:tcW w:w="0" w:type="auto"/>
+            <w:hideMark/>
+          </w:tcPr>
+          <w:p>
+            <w:pPr>
+              <w:spacing w:after="200" w:line="276" w:lineRule="auto"/>
+              <w:rPr>
+                <w:lang w:eastAsia="zh-CN"/>
+              </w:rPr>
+            </w:pPr>
+            <w:r>
+              <w:rPr>
+                <w:lang w:eastAsia="zh-CN"/>
+              </w:rPr>
+              <w:t>数据库保留 low_moisture 等机器码，前端统一映射为“湿度过低”等中文标签，并按机器码筛选</w:t>
+            </w:r>
+          </w:p>
+        </w:tc>
+        <w:tc>
+          <w:tcPr>
+            <w:tcW w:w="0" w:type="auto"/>
+            <w:hideMark/>
+          </w:tcPr>
+          <w:p>
+            <w:pPr>
+              <w:spacing w:after="200" w:line="276" w:lineRule="auto"/>
+              <w:rPr>
+                <w:lang w:eastAsia="zh-CN"/>
+              </w:rPr>
+            </w:pPr>
+            <w:r>
+              <w:rPr>
+                <w:lang w:eastAsia="zh-CN"/>
+              </w:rPr>
+              <w:t>不需要</w:t>
+            </w:r>
+          </w:p>
+        </w:tc>
+      </w:tr>
+      <w:tr>
+        <w:tc>
+          <w:tcPr>
+            <w:tcW w:w="0" w:type="auto"/>
+            <w:hideMark/>
+          </w:tcPr>
+          <w:p>
+            <w:pPr>
+              <w:spacing w:after="200" w:line="276" w:lineRule="auto"/>
+              <w:rPr>
+                <w:lang w:eastAsia="zh-CN"/>
+              </w:rPr>
+            </w:pPr>
+            <w:r>
+              <w:rPr>
+                <w:lang w:eastAsia="zh-CN"/>
+              </w:rPr>
+              <w:t>告警说明</w:t>
+            </w:r>
+          </w:p>
+        </w:tc>
+        <w:tc>
+          <w:tcPr>
+            <w:tcW w:w="0" w:type="auto"/>
+            <w:hideMark/>
+          </w:tcPr>
+          <w:p>
+            <w:pPr>
+              <w:spacing w:after="200" w:line="276" w:lineRule="auto"/>
+              <w:rPr>
+                <w:lang w:eastAsia="zh-CN"/>
+              </w:rPr>
+            </w:pPr>
+            <w:r>
+              <w:rPr>
+                <w:lang w:eastAsia="zh-CN"/>
+              </w:rPr>
+              <w:t>新产生的说明改为中文；旧演示告警可一次性补中文</w:t>
+            </w:r>
+          </w:p>
+        </w:tc>
+        <w:tc>
+          <w:tcPr>
+            <w:tcW w:w="0" w:type="auto"/>
+            <w:hideMark/>
+          </w:tcPr>
+          <w:p>
+            <w:pPr>
+              <w:spacing w:after="200" w:line="276" w:lineRule="auto"/>
+              <w:rPr>
+                <w:lang w:eastAsia="zh-CN"/>
+              </w:rPr>
+            </w:pPr>
+            <w:r>
+              <w:rPr>
+                <w:lang w:eastAsia="zh-CN"/>
+              </w:rPr>
+              <w:t>可选数据迁移</w:t>
+            </w:r>
+          </w:p>
+        </w:tc>
+      </w:tr>
+      <w:tr>
+        <w:tc>
+          <w:tcPr>
+            <w:tcW w:w="0" w:type="auto"/>
+            <w:hideMark/>
+          </w:tcPr>
+          <w:p>
+            <w:pPr>
+              <w:spacing w:after="200" w:line="276" w:lineRule="auto"/>
+              <w:rPr>
+                <w:lang w:eastAsia="zh-CN"/>
+              </w:rPr>
+            </w:pPr>
+            <w:r>
+              <w:rPr>
+                <w:lang w:eastAsia="zh-CN"/>
+              </w:rPr>
+              <w:t>时间显示</w:t>
+            </w:r>
+          </w:p>
+        </w:tc>
+        <w:tc>
+          <w:tcPr>
+            <w:tcW w:w="0" w:type="auto"/>
+            <w:hideMark/>
+          </w:tcPr>
+          <w:p>
+            <w:pPr>
+              <w:spacing w:after="200" w:line="276" w:lineRule="auto"/>
+              <w:rPr>
+                <w:lang w:eastAsia="zh-CN"/>
+              </w:rPr>
+            </w:pPr>
+            <w:r>
+              <w:rPr>
+                <w:lang w:eastAsia="zh-CN"/>
+              </w:rPr>
+              <w:t>数据库继续统一存 UTC，接口保留 Z；前端展示时统一转 Asia/Shanghai</w:t>
+            </w:r>
+          </w:p>
+        </w:tc>
+        <w:tc>
+          <w:tcPr>
+            <w:tcW w:w="0" w:type="auto"/>
+            <w:hideMark/>
+          </w:tcPr>
+          <w:p>
+            <w:pPr>
+              <w:spacing w:after="200" w:line="276" w:lineRule="auto"/>
+              <w:rPr>
+                <w:lang w:eastAsia="zh-CN"/>
+              </w:rPr>
+            </w:pPr>
+            <w:r>
+              <w:rPr>
+                <w:lang w:eastAsia="zh-CN"/>
+              </w:rPr>
+              <w:t>不需要</w:t>
+            </w:r>
+          </w:p>
+        </w:tc>
+      </w:tr>
+    </w:tbl>
+    <w:p>
+      <w:pPr>
+        <w:rPr>
+          <w:rFonts w:hint="eastAsia"/>
+          <w:lang w:eastAsia="zh-CN"/>
+        </w:rPr>
+      </w:pPr>
     </w:p>
     <w:sectPr>
       <w:pgSz w:w="12240" w:h="15840"/>

</xml_diff>

<commit_message>
feat: add orchard production workflow
</commit_message>
<xml_diff>
--- a/docs/architecture/基本功能-数据库表.docx
+++ b/docs/architecture/基本功能-数据库表.docx
@@ -7421,6 +7421,589 @@
     <w:p>
       <w:pPr>
         <w:rPr>
+          <w:lang w:eastAsia="zh-CN"/>
+        </w:rPr>
+      </w:pPr>
+    </w:p>
+    <w:p>
+      <w:pPr>
+        <w:rPr>
+          <w:lang w:eastAsia="zh-CN"/>
+        </w:rPr>
+      </w:pPr>
+    </w:p>
+    <w:tbl>
+      <w:tblPr>
+        <w:tblStyle w:val="aff1"/>
+        <w:tblW w:w="0" w:type="auto"/>
+        <w:tblLook w:val="04A0" w:firstRow="1" w:lastRow="0" w:firstColumn="1" w:lastColumn="0" w:noHBand="0" w:noVBand="1"/>
+      </w:tblPr>
+      <w:tblGrid>
+        <w:gridCol w:w="618"/>
+        <w:gridCol w:w="7450"/>
+        <w:gridCol w:w="1940"/>
+      </w:tblGrid>
+      <w:tr>
+        <w:tc>
+          <w:tcPr>
+            <w:tcW w:w="0" w:type="auto"/>
+            <w:hideMark/>
+          </w:tcPr>
+          <w:p>
+            <w:pPr>
+              <w:spacing w:after="200" w:line="276" w:lineRule="auto"/>
+              <w:rPr>
+                <w:b/>
+                <w:bCs/>
+                <w:lang w:eastAsia="zh-CN"/>
+              </w:rPr>
+            </w:pPr>
+            <w:r>
+              <w:rPr>
+                <w:b/>
+                <w:bCs/>
+                <w:lang w:eastAsia="zh-CN"/>
+              </w:rPr>
+              <w:t>概念</w:t>
+            </w:r>
+          </w:p>
+        </w:tc>
+        <w:tc>
+          <w:tcPr>
+            <w:tcW w:w="0" w:type="auto"/>
+            <w:hideMark/>
+          </w:tcPr>
+          <w:p>
+            <w:pPr>
+              <w:spacing w:after="200" w:line="276" w:lineRule="auto"/>
+              <w:rPr>
+                <w:b/>
+                <w:bCs/>
+                <w:lang w:eastAsia="zh-CN"/>
+              </w:rPr>
+            </w:pPr>
+            <w:r>
+              <w:rPr>
+                <w:b/>
+                <w:bCs/>
+                <w:lang w:eastAsia="zh-CN"/>
+              </w:rPr>
+              <w:t>是什么</w:t>
+            </w:r>
+          </w:p>
+        </w:tc>
+        <w:tc>
+          <w:tcPr>
+            <w:tcW w:w="0" w:type="auto"/>
+            <w:hideMark/>
+          </w:tcPr>
+          <w:p>
+            <w:pPr>
+              <w:spacing w:after="200" w:line="276" w:lineRule="auto"/>
+              <w:rPr>
+                <w:b/>
+                <w:bCs/>
+                <w:lang w:eastAsia="zh-CN"/>
+              </w:rPr>
+            </w:pPr>
+            <w:r>
+              <w:rPr>
+                <w:b/>
+                <w:bCs/>
+                <w:lang w:eastAsia="zh-CN"/>
+              </w:rPr>
+              <w:t>谁负责</w:t>
+            </w:r>
+          </w:p>
+        </w:tc>
+      </w:tr>
+      <w:tr>
+        <w:tc>
+          <w:tcPr>
+            <w:tcW w:w="0" w:type="auto"/>
+            <w:hideMark/>
+          </w:tcPr>
+          <w:p>
+            <w:pPr>
+              <w:spacing w:after="200" w:line="276" w:lineRule="auto"/>
+              <w:rPr>
+                <w:lang w:eastAsia="zh-CN"/>
+              </w:rPr>
+            </w:pPr>
+            <w:r>
+              <w:rPr>
+                <w:lang w:eastAsia="zh-CN"/>
+              </w:rPr>
+              <w:t>模板</w:t>
+            </w:r>
+          </w:p>
+        </w:tc>
+        <w:tc>
+          <w:tcPr>
+            <w:tcW w:w="0" w:type="auto"/>
+            <w:hideMark/>
+          </w:tcPr>
+          <w:p>
+            <w:pPr>
+              <w:spacing w:after="200" w:line="276" w:lineRule="auto"/>
+              <w:rPr>
+                <w:lang w:eastAsia="zh-CN"/>
+              </w:rPr>
+            </w:pPr>
+            <w:r>
+              <w:rPr>
+                <w:lang w:eastAsia="zh-CN"/>
+              </w:rPr>
+              <w:t>脐橙一个生产周期的标准作业配方，例如阶段、巡园、施肥、修剪、采收后的任务规则</w:t>
+            </w:r>
+          </w:p>
+        </w:tc>
+        <w:tc>
+          <w:tcPr>
+            <w:tcW w:w="0" w:type="auto"/>
+            <w:hideMark/>
+          </w:tcPr>
+          <w:p>
+            <w:pPr>
+              <w:spacing w:after="200" w:line="276" w:lineRule="auto"/>
+              <w:rPr>
+                <w:lang w:eastAsia="zh-CN"/>
+              </w:rPr>
+            </w:pPr>
+            <w:r>
+              <w:rPr>
+                <w:lang w:eastAsia="zh-CN"/>
+              </w:rPr>
+              <w:t>系统管理员</w:t>
+            </w:r>
+          </w:p>
+        </w:tc>
+      </w:tr>
+      <w:tr>
+        <w:tc>
+          <w:tcPr>
+            <w:tcW w:w="0" w:type="auto"/>
+            <w:hideMark/>
+          </w:tcPr>
+          <w:p>
+            <w:pPr>
+              <w:spacing w:after="200" w:line="276" w:lineRule="auto"/>
+              <w:rPr>
+                <w:lang w:eastAsia="zh-CN"/>
+              </w:rPr>
+            </w:pPr>
+            <w:r>
+              <w:rPr>
+                <w:lang w:eastAsia="zh-CN"/>
+              </w:rPr>
+              <w:t>草稿</w:t>
+            </w:r>
+          </w:p>
+        </w:tc>
+        <w:tc>
+          <w:tcPr>
+            <w:tcW w:w="0" w:type="auto"/>
+            <w:hideMark/>
+          </w:tcPr>
+          <w:p>
+            <w:pPr>
+              <w:spacing w:after="200" w:line="276" w:lineRule="auto"/>
+              <w:rPr>
+                <w:lang w:eastAsia="zh-CN"/>
+              </w:rPr>
+            </w:pPr>
+            <w:r>
+              <w:rPr>
+                <w:lang w:eastAsia="zh-CN"/>
+              </w:rPr>
+              <w:t>对“下一生产周期”模板的待发布修改版</w:t>
+            </w:r>
+          </w:p>
+        </w:tc>
+        <w:tc>
+          <w:tcPr>
+            <w:tcW w:w="0" w:type="auto"/>
+            <w:hideMark/>
+          </w:tcPr>
+          <w:p>
+            <w:pPr>
+              <w:spacing w:after="200" w:line="276" w:lineRule="auto"/>
+              <w:rPr>
+                <w:lang w:eastAsia="zh-CN"/>
+              </w:rPr>
+            </w:pPr>
+            <w:r>
+              <w:rPr>
+                <w:lang w:eastAsia="zh-CN"/>
+              </w:rPr>
+              <w:t>系统管理员</w:t>
+            </w:r>
+          </w:p>
+        </w:tc>
+      </w:tr>
+      <w:tr>
+        <w:tc>
+          <w:tcPr>
+            <w:tcW w:w="0" w:type="auto"/>
+            <w:hideMark/>
+          </w:tcPr>
+          <w:p>
+            <w:pPr>
+              <w:spacing w:after="200" w:line="276" w:lineRule="auto"/>
+              <w:rPr>
+                <w:lang w:eastAsia="zh-CN"/>
+              </w:rPr>
+            </w:pPr>
+            <w:r>
+              <w:rPr>
+                <w:lang w:eastAsia="zh-CN"/>
+              </w:rPr>
+              <w:t>计划</w:t>
+            </w:r>
+          </w:p>
+        </w:tc>
+        <w:tc>
+          <w:tcPr>
+            <w:tcW w:w="0" w:type="auto"/>
+            <w:hideMark/>
+          </w:tcPr>
+          <w:p>
+            <w:pPr>
+              <w:spacing w:after="200" w:line="276" w:lineRule="auto"/>
+              <w:rPr>
+                <w:lang w:eastAsia="zh-CN"/>
+              </w:rPr>
+            </w:pPr>
+            <w:r>
+              <w:rPr>
+                <w:lang w:eastAsia="zh-CN"/>
+              </w:rPr>
+              <w:t>根据某个农场的模板版本、统一定植日期，为该农场每个地块生成的实际任务清单</w:t>
+            </w:r>
+          </w:p>
+        </w:tc>
+        <w:tc>
+          <w:tcPr>
+            <w:tcW w:w="0" w:type="auto"/>
+            <w:hideMark/>
+          </w:tcPr>
+          <w:p>
+            <w:pPr>
+              <w:spacing w:after="200" w:line="276" w:lineRule="auto"/>
+              <w:rPr>
+                <w:lang w:eastAsia="zh-CN"/>
+              </w:rPr>
+            </w:pPr>
+            <w:r>
+              <w:rPr>
+                <w:lang w:eastAsia="zh-CN"/>
+              </w:rPr>
+              <w:t>系统管理员一键生成</w:t>
+            </w:r>
+          </w:p>
+        </w:tc>
+      </w:tr>
+    </w:tbl>
+    <w:p>
+      <w:pPr>
+        <w:rPr>
+          <w:lang w:eastAsia="zh-CN"/>
+        </w:rPr>
+      </w:pPr>
+    </w:p>
+    <w:p>
+      <w:pPr>
+        <w:rPr>
+          <w:lang w:eastAsia="zh-CN"/>
+        </w:rPr>
+      </w:pPr>
+    </w:p>
+    <w:tbl>
+      <w:tblPr>
+        <w:tblStyle w:val="aff1"/>
+        <w:tblW w:w="0" w:type="auto"/>
+        <w:tblLook w:val="04A0" w:firstRow="1" w:lastRow="0" w:firstColumn="1" w:lastColumn="0" w:noHBand="0" w:noVBand="1"/>
+      </w:tblPr>
+      <w:tblGrid>
+        <w:gridCol w:w="1187"/>
+        <w:gridCol w:w="8821"/>
+      </w:tblGrid>
+      <w:tr>
+        <w:tc>
+          <w:tcPr>
+            <w:tcW w:w="0" w:type="auto"/>
+            <w:hideMark/>
+          </w:tcPr>
+          <w:p>
+            <w:pPr>
+              <w:spacing w:after="200" w:line="276" w:lineRule="auto"/>
+              <w:rPr>
+                <w:b/>
+                <w:bCs/>
+                <w:lang w:eastAsia="zh-CN"/>
+              </w:rPr>
+            </w:pPr>
+            <w:r>
+              <w:rPr>
+                <w:b/>
+                <w:bCs/>
+                <w:lang w:eastAsia="zh-CN"/>
+              </w:rPr>
+              <w:t>角色</w:t>
+            </w:r>
+          </w:p>
+        </w:tc>
+        <w:tc>
+          <w:tcPr>
+            <w:tcW w:w="0" w:type="auto"/>
+            <w:hideMark/>
+          </w:tcPr>
+          <w:p>
+            <w:pPr>
+              <w:spacing w:after="200" w:line="276" w:lineRule="auto"/>
+              <w:rPr>
+                <w:b/>
+                <w:bCs/>
+                <w:lang w:eastAsia="zh-CN"/>
+              </w:rPr>
+            </w:pPr>
+            <w:r>
+              <w:rPr>
+                <w:b/>
+                <w:bCs/>
+                <w:lang w:eastAsia="zh-CN"/>
+              </w:rPr>
+              <w:t>负责什么</w:t>
+            </w:r>
+          </w:p>
+        </w:tc>
+      </w:tr>
+      <w:tr>
+        <w:tc>
+          <w:tcPr>
+            <w:tcW w:w="0" w:type="auto"/>
+            <w:hideMark/>
+          </w:tcPr>
+          <w:p>
+            <w:pPr>
+              <w:spacing w:after="200" w:line="276" w:lineRule="auto"/>
+              <w:rPr>
+                <w:lang w:eastAsia="zh-CN"/>
+              </w:rPr>
+            </w:pPr>
+            <w:r>
+              <w:rPr>
+                <w:lang w:eastAsia="zh-CN"/>
+              </w:rPr>
+              <w:t>系统管理</w:t>
+            </w:r>
+            <w:r>
+              <w:rPr>
+                <w:lang w:eastAsia="zh-CN"/>
+              </w:rPr>
+              <w:lastRenderedPageBreak/>
+              <w:t>员</w:t>
+            </w:r>
+          </w:p>
+        </w:tc>
+        <w:tc>
+          <w:tcPr>
+            <w:tcW w:w="0" w:type="auto"/>
+            <w:hideMark/>
+          </w:tcPr>
+          <w:p>
+            <w:pPr>
+              <w:spacing w:after="200" w:line="276" w:lineRule="auto"/>
+              <w:rPr>
+                <w:lang w:eastAsia="zh-CN"/>
+              </w:rPr>
+            </w:pPr>
+            <w:r>
+              <w:rPr>
+                <w:lang w:eastAsia="zh-CN"/>
+              </w:rPr>
+              <w:lastRenderedPageBreak/>
+              <w:t>员工账号、农场和地块基础档案、授权范围；维护“标准模板库”</w:t>
+            </w:r>
+          </w:p>
+        </w:tc>
+      </w:tr>
+      <w:tr>
+        <w:tc>
+          <w:tcPr>
+            <w:tcW w:w="0" w:type="auto"/>
+            <w:hideMark/>
+          </w:tcPr>
+          <w:p>
+            <w:pPr>
+              <w:spacing w:after="200" w:line="276" w:lineRule="auto"/>
+              <w:rPr>
+                <w:lang w:eastAsia="zh-CN"/>
+              </w:rPr>
+            </w:pPr>
+            <w:r>
+              <w:rPr>
+                <w:lang w:eastAsia="zh-CN"/>
+              </w:rPr>
+              <w:t>农场管理员</w:t>
+            </w:r>
+          </w:p>
+        </w:tc>
+        <w:tc>
+          <w:tcPr>
+            <w:tcW w:w="0" w:type="auto"/>
+            <w:hideMark/>
+          </w:tcPr>
+          <w:p>
+            <w:pPr>
+              <w:spacing w:after="200" w:line="276" w:lineRule="auto"/>
+              <w:rPr>
+                <w:lang w:eastAsia="zh-CN"/>
+              </w:rPr>
+            </w:pPr>
+            <w:r>
+              <w:rPr>
+                <w:lang w:eastAsia="zh-CN"/>
+              </w:rPr>
+              <w:t>结合本农场实际情况，选择标准模板、维护本农场生产周期、修改下一周期作业方案、生成本农场计划</w:t>
+            </w:r>
+          </w:p>
+        </w:tc>
+      </w:tr>
+      <w:tr>
+        <w:tc>
+          <w:tcPr>
+            <w:tcW w:w="0" w:type="auto"/>
+            <w:hideMark/>
+          </w:tcPr>
+          <w:p>
+            <w:pPr>
+              <w:spacing w:after="200" w:line="276" w:lineRule="auto"/>
+              <w:rPr>
+                <w:lang w:eastAsia="zh-CN"/>
+              </w:rPr>
+            </w:pPr>
+            <w:r>
+              <w:rPr>
+                <w:lang w:eastAsia="zh-CN"/>
+              </w:rPr>
+              <w:t>农户</w:t>
+            </w:r>
+          </w:p>
+        </w:tc>
+        <w:tc>
+          <w:tcPr>
+            <w:tcW w:w="0" w:type="auto"/>
+            <w:hideMark/>
+          </w:tcPr>
+          <w:p>
+            <w:pPr>
+              <w:spacing w:after="200" w:line="276" w:lineRule="auto"/>
+              <w:rPr>
+                <w:lang w:eastAsia="zh-CN"/>
+              </w:rPr>
+            </w:pPr>
+            <w:r>
+              <w:rPr>
+                <w:lang w:eastAsia="zh-CN"/>
+              </w:rPr>
+              <w:t>执行自己地块的任务，调整日期/备注/状态，登记完成和计划外农事</w:t>
+            </w:r>
+          </w:p>
+        </w:tc>
+      </w:tr>
+    </w:tbl>
+    <w:p>
+      <w:pPr>
+        <w:rPr>
+          <w:lang w:eastAsia="zh-CN"/>
+        </w:rPr>
+      </w:pPr>
+    </w:p>
+    <w:p>
+      <w:pPr>
+        <w:rPr>
+          <w:lang w:eastAsia="zh-CN"/>
+        </w:rPr>
+      </w:pPr>
+      <w:r>
+        <w:rPr>
+          <w:lang w:eastAsia="zh-CN"/>
+        </w:rPr>
+        <w:t>同时把名称区分清楚：</w:t>
+      </w:r>
+    </w:p>
+    <w:p>
+      <w:pPr>
+        <w:numPr>
+          <w:ilvl w:val="0"/>
+          <w:numId w:val="12"/>
+        </w:numPr>
+        <w:rPr>
+          <w:lang w:eastAsia="zh-CN"/>
+        </w:rPr>
+      </w:pPr>
+      <w:r>
+        <w:rPr>
+          <w:lang w:eastAsia="zh-CN"/>
+        </w:rPr>
+        <w:t>标准模板：平台级的通用脐橙管理规范，由系统管理员维护。</w:t>
+      </w:r>
+    </w:p>
+    <w:p>
+      <w:pPr>
+        <w:numPr>
+          <w:ilvl w:val="0"/>
+          <w:numId w:val="12"/>
+        </w:numPr>
+        <w:rPr>
+          <w:lang w:eastAsia="zh-CN"/>
+        </w:rPr>
+      </w:pPr>
+      <w:r>
+        <w:rPr>
+          <w:lang w:eastAsia="zh-CN"/>
+        </w:rPr>
+        <w:t>农场周期版本：农场管理员基于标准模板，为自己农场下一周期调整后的版本。</w:t>
+      </w:r>
+    </w:p>
+    <w:p>
+      <w:pPr>
+        <w:numPr>
+          <w:ilvl w:val="0"/>
+          <w:numId w:val="12"/>
+        </w:numPr>
+        <w:rPr>
+          <w:lang w:eastAsia="zh-CN"/>
+        </w:rPr>
+      </w:pPr>
+      <w:r>
+        <w:rPr>
+          <w:lang w:eastAsia="zh-CN"/>
+        </w:rPr>
+        <w:t>草稿：农场管理员在采收清园后，为下一周期修改的“农场周期版本”。</w:t>
+      </w:r>
+    </w:p>
+    <w:p>
+      <w:pPr>
+        <w:numPr>
+          <w:ilvl w:val="0"/>
+          <w:numId w:val="12"/>
+        </w:numPr>
+        <w:rPr>
+          <w:lang w:eastAsia="zh-CN"/>
+        </w:rPr>
+      </w:pPr>
+      <w:r>
+        <w:rPr>
+          <w:lang w:eastAsia="zh-CN"/>
+        </w:rPr>
+        <w:t>计划：系统根据农场管理员确认的周期版本和统一定植日期，为各地块生成的任务清单。</w:t>
+      </w:r>
+    </w:p>
+    <w:p>
+      <w:pPr>
+        <w:rPr>
           <w:rFonts w:hint="eastAsia"/>
           <w:lang w:eastAsia="zh-CN"/>
         </w:rPr>
@@ -7957,6 +8540,155 @@
       </w:rPr>
     </w:lvl>
   </w:abstractNum>
+  <w:abstractNum w:abstractNumId="11" w15:restartNumberingAfterBreak="0">
+    <w:nsid w:val="5EFD56F1"/>
+    <w:multiLevelType w:val="multilevel"/>
+    <w:tmpl w:val="514C3708"/>
+    <w:lvl w:ilvl="0">
+      <w:start w:val="1"/>
+      <w:numFmt w:val="bullet"/>
+      <w:lvlText w:val=""/>
+      <w:lvlJc w:val="left"/>
+      <w:pPr>
+        <w:tabs>
+          <w:tab w:val="num" w:pos="720"/>
+        </w:tabs>
+        <w:ind w:left="720" w:hanging="360"/>
+      </w:pPr>
+      <w:rPr>
+        <w:rFonts w:ascii="Symbol" w:hAnsi="Symbol" w:hint="default"/>
+        <w:sz w:val="20"/>
+      </w:rPr>
+    </w:lvl>
+    <w:lvl w:ilvl="1" w:tentative="1">
+      <w:start w:val="1"/>
+      <w:numFmt w:val="bullet"/>
+      <w:lvlText w:val="o"/>
+      <w:lvlJc w:val="left"/>
+      <w:pPr>
+        <w:tabs>
+          <w:tab w:val="num" w:pos="1440"/>
+        </w:tabs>
+        <w:ind w:left="1440" w:hanging="360"/>
+      </w:pPr>
+      <w:rPr>
+        <w:rFonts w:ascii="Courier New" w:hAnsi="Courier New" w:hint="default"/>
+        <w:sz w:val="20"/>
+      </w:rPr>
+    </w:lvl>
+    <w:lvl w:ilvl="2" w:tentative="1">
+      <w:start w:val="1"/>
+      <w:numFmt w:val="bullet"/>
+      <w:lvlText w:val=""/>
+      <w:lvlJc w:val="left"/>
+      <w:pPr>
+        <w:tabs>
+          <w:tab w:val="num" w:pos="2160"/>
+        </w:tabs>
+        <w:ind w:left="2160" w:hanging="360"/>
+      </w:pPr>
+      <w:rPr>
+        <w:rFonts w:ascii="Wingdings" w:hAnsi="Wingdings" w:hint="default"/>
+        <w:sz w:val="20"/>
+      </w:rPr>
+    </w:lvl>
+    <w:lvl w:ilvl="3" w:tentative="1">
+      <w:start w:val="1"/>
+      <w:numFmt w:val="bullet"/>
+      <w:lvlText w:val=""/>
+      <w:lvlJc w:val="left"/>
+      <w:pPr>
+        <w:tabs>
+          <w:tab w:val="num" w:pos="2880"/>
+        </w:tabs>
+        <w:ind w:left="2880" w:hanging="360"/>
+      </w:pPr>
+      <w:rPr>
+        <w:rFonts w:ascii="Wingdings" w:hAnsi="Wingdings" w:hint="default"/>
+        <w:sz w:val="20"/>
+      </w:rPr>
+    </w:lvl>
+    <w:lvl w:ilvl="4" w:tentative="1">
+      <w:start w:val="1"/>
+      <w:numFmt w:val="bullet"/>
+      <w:lvlText w:val=""/>
+      <w:lvlJc w:val="left"/>
+      <w:pPr>
+        <w:tabs>
+          <w:tab w:val="num" w:pos="3600"/>
+        </w:tabs>
+        <w:ind w:left="3600" w:hanging="360"/>
+      </w:pPr>
+      <w:rPr>
+        <w:rFonts w:ascii="Wingdings" w:hAnsi="Wingdings" w:hint="default"/>
+        <w:sz w:val="20"/>
+      </w:rPr>
+    </w:lvl>
+    <w:lvl w:ilvl="5" w:tentative="1">
+      <w:start w:val="1"/>
+      <w:numFmt w:val="bullet"/>
+      <w:lvlText w:val=""/>
+      <w:lvlJc w:val="left"/>
+      <w:pPr>
+        <w:tabs>
+          <w:tab w:val="num" w:pos="4320"/>
+        </w:tabs>
+        <w:ind w:left="4320" w:hanging="360"/>
+      </w:pPr>
+      <w:rPr>
+        <w:rFonts w:ascii="Wingdings" w:hAnsi="Wingdings" w:hint="default"/>
+        <w:sz w:val="20"/>
+      </w:rPr>
+    </w:lvl>
+    <w:lvl w:ilvl="6" w:tentative="1">
+      <w:start w:val="1"/>
+      <w:numFmt w:val="bullet"/>
+      <w:lvlText w:val=""/>
+      <w:lvlJc w:val="left"/>
+      <w:pPr>
+        <w:tabs>
+          <w:tab w:val="num" w:pos="5040"/>
+        </w:tabs>
+        <w:ind w:left="5040" w:hanging="360"/>
+      </w:pPr>
+      <w:rPr>
+        <w:rFonts w:ascii="Wingdings" w:hAnsi="Wingdings" w:hint="default"/>
+        <w:sz w:val="20"/>
+      </w:rPr>
+    </w:lvl>
+    <w:lvl w:ilvl="7" w:tentative="1">
+      <w:start w:val="1"/>
+      <w:numFmt w:val="bullet"/>
+      <w:lvlText w:val=""/>
+      <w:lvlJc w:val="left"/>
+      <w:pPr>
+        <w:tabs>
+          <w:tab w:val="num" w:pos="5760"/>
+        </w:tabs>
+        <w:ind w:left="5760" w:hanging="360"/>
+      </w:pPr>
+      <w:rPr>
+        <w:rFonts w:ascii="Wingdings" w:hAnsi="Wingdings" w:hint="default"/>
+        <w:sz w:val="20"/>
+      </w:rPr>
+    </w:lvl>
+    <w:lvl w:ilvl="8" w:tentative="1">
+      <w:start w:val="1"/>
+      <w:numFmt w:val="bullet"/>
+      <w:lvlText w:val=""/>
+      <w:lvlJc w:val="left"/>
+      <w:pPr>
+        <w:tabs>
+          <w:tab w:val="num" w:pos="6480"/>
+        </w:tabs>
+        <w:ind w:left="6480" w:hanging="360"/>
+      </w:pPr>
+      <w:rPr>
+        <w:rFonts w:ascii="Wingdings" w:hAnsi="Wingdings" w:hint="default"/>
+        <w:sz w:val="20"/>
+      </w:rPr>
+    </w:lvl>
+  </w:abstractNum>
   <w:num w:numId="1" w16cid:durableId="1366712381">
     <w:abstractNumId w:val="8"/>
   </w:num>
@@ -7989,6 +8721,9 @@
   </w:num>
   <w:num w:numId="11" w16cid:durableId="700396078">
     <w:abstractNumId w:val="9"/>
+  </w:num>
+  <w:num w:numId="12" w16cid:durableId="1449540797">
+    <w:abstractNumId w:val="11"/>
   </w:num>
 </w:numbering>
 </file>

</xml_diff>

<commit_message>
feat: replace deployed project with final version
</commit_message>
<xml_diff>
--- a/docs/architecture/基本功能-数据库表.docx
+++ b/docs/architecture/基本功能-数据库表.docx
@@ -7421,6 +7421,589 @@
     <w:p>
       <w:pPr>
         <w:rPr>
+          <w:lang w:eastAsia="zh-CN"/>
+        </w:rPr>
+      </w:pPr>
+    </w:p>
+    <w:p>
+      <w:pPr>
+        <w:rPr>
+          <w:lang w:eastAsia="zh-CN"/>
+        </w:rPr>
+      </w:pPr>
+    </w:p>
+    <w:tbl>
+      <w:tblPr>
+        <w:tblStyle w:val="aff1"/>
+        <w:tblW w:w="0" w:type="auto"/>
+        <w:tblLook w:val="04A0" w:firstRow="1" w:lastRow="0" w:firstColumn="1" w:lastColumn="0" w:noHBand="0" w:noVBand="1"/>
+      </w:tblPr>
+      <w:tblGrid>
+        <w:gridCol w:w="618"/>
+        <w:gridCol w:w="7450"/>
+        <w:gridCol w:w="1940"/>
+      </w:tblGrid>
+      <w:tr>
+        <w:tc>
+          <w:tcPr>
+            <w:tcW w:w="0" w:type="auto"/>
+            <w:hideMark/>
+          </w:tcPr>
+          <w:p>
+            <w:pPr>
+              <w:spacing w:after="200" w:line="276" w:lineRule="auto"/>
+              <w:rPr>
+                <w:b/>
+                <w:bCs/>
+                <w:lang w:eastAsia="zh-CN"/>
+              </w:rPr>
+            </w:pPr>
+            <w:r>
+              <w:rPr>
+                <w:b/>
+                <w:bCs/>
+                <w:lang w:eastAsia="zh-CN"/>
+              </w:rPr>
+              <w:t>概念</w:t>
+            </w:r>
+          </w:p>
+        </w:tc>
+        <w:tc>
+          <w:tcPr>
+            <w:tcW w:w="0" w:type="auto"/>
+            <w:hideMark/>
+          </w:tcPr>
+          <w:p>
+            <w:pPr>
+              <w:spacing w:after="200" w:line="276" w:lineRule="auto"/>
+              <w:rPr>
+                <w:b/>
+                <w:bCs/>
+                <w:lang w:eastAsia="zh-CN"/>
+              </w:rPr>
+            </w:pPr>
+            <w:r>
+              <w:rPr>
+                <w:b/>
+                <w:bCs/>
+                <w:lang w:eastAsia="zh-CN"/>
+              </w:rPr>
+              <w:t>是什么</w:t>
+            </w:r>
+          </w:p>
+        </w:tc>
+        <w:tc>
+          <w:tcPr>
+            <w:tcW w:w="0" w:type="auto"/>
+            <w:hideMark/>
+          </w:tcPr>
+          <w:p>
+            <w:pPr>
+              <w:spacing w:after="200" w:line="276" w:lineRule="auto"/>
+              <w:rPr>
+                <w:b/>
+                <w:bCs/>
+                <w:lang w:eastAsia="zh-CN"/>
+              </w:rPr>
+            </w:pPr>
+            <w:r>
+              <w:rPr>
+                <w:b/>
+                <w:bCs/>
+                <w:lang w:eastAsia="zh-CN"/>
+              </w:rPr>
+              <w:t>谁负责</w:t>
+            </w:r>
+          </w:p>
+        </w:tc>
+      </w:tr>
+      <w:tr>
+        <w:tc>
+          <w:tcPr>
+            <w:tcW w:w="0" w:type="auto"/>
+            <w:hideMark/>
+          </w:tcPr>
+          <w:p>
+            <w:pPr>
+              <w:spacing w:after="200" w:line="276" w:lineRule="auto"/>
+              <w:rPr>
+                <w:lang w:eastAsia="zh-CN"/>
+              </w:rPr>
+            </w:pPr>
+            <w:r>
+              <w:rPr>
+                <w:lang w:eastAsia="zh-CN"/>
+              </w:rPr>
+              <w:t>模板</w:t>
+            </w:r>
+          </w:p>
+        </w:tc>
+        <w:tc>
+          <w:tcPr>
+            <w:tcW w:w="0" w:type="auto"/>
+            <w:hideMark/>
+          </w:tcPr>
+          <w:p>
+            <w:pPr>
+              <w:spacing w:after="200" w:line="276" w:lineRule="auto"/>
+              <w:rPr>
+                <w:lang w:eastAsia="zh-CN"/>
+              </w:rPr>
+            </w:pPr>
+            <w:r>
+              <w:rPr>
+                <w:lang w:eastAsia="zh-CN"/>
+              </w:rPr>
+              <w:t>脐橙一个生产周期的标准作业配方，例如阶段、巡园、施肥、修剪、采收后的任务规则</w:t>
+            </w:r>
+          </w:p>
+        </w:tc>
+        <w:tc>
+          <w:tcPr>
+            <w:tcW w:w="0" w:type="auto"/>
+            <w:hideMark/>
+          </w:tcPr>
+          <w:p>
+            <w:pPr>
+              <w:spacing w:after="200" w:line="276" w:lineRule="auto"/>
+              <w:rPr>
+                <w:lang w:eastAsia="zh-CN"/>
+              </w:rPr>
+            </w:pPr>
+            <w:r>
+              <w:rPr>
+                <w:lang w:eastAsia="zh-CN"/>
+              </w:rPr>
+              <w:t>系统管理员</w:t>
+            </w:r>
+          </w:p>
+        </w:tc>
+      </w:tr>
+      <w:tr>
+        <w:tc>
+          <w:tcPr>
+            <w:tcW w:w="0" w:type="auto"/>
+            <w:hideMark/>
+          </w:tcPr>
+          <w:p>
+            <w:pPr>
+              <w:spacing w:after="200" w:line="276" w:lineRule="auto"/>
+              <w:rPr>
+                <w:lang w:eastAsia="zh-CN"/>
+              </w:rPr>
+            </w:pPr>
+            <w:r>
+              <w:rPr>
+                <w:lang w:eastAsia="zh-CN"/>
+              </w:rPr>
+              <w:t>草稿</w:t>
+            </w:r>
+          </w:p>
+        </w:tc>
+        <w:tc>
+          <w:tcPr>
+            <w:tcW w:w="0" w:type="auto"/>
+            <w:hideMark/>
+          </w:tcPr>
+          <w:p>
+            <w:pPr>
+              <w:spacing w:after="200" w:line="276" w:lineRule="auto"/>
+              <w:rPr>
+                <w:lang w:eastAsia="zh-CN"/>
+              </w:rPr>
+            </w:pPr>
+            <w:r>
+              <w:rPr>
+                <w:lang w:eastAsia="zh-CN"/>
+              </w:rPr>
+              <w:t>对“下一生产周期”模板的待发布修改版</w:t>
+            </w:r>
+          </w:p>
+        </w:tc>
+        <w:tc>
+          <w:tcPr>
+            <w:tcW w:w="0" w:type="auto"/>
+            <w:hideMark/>
+          </w:tcPr>
+          <w:p>
+            <w:pPr>
+              <w:spacing w:after="200" w:line="276" w:lineRule="auto"/>
+              <w:rPr>
+                <w:lang w:eastAsia="zh-CN"/>
+              </w:rPr>
+            </w:pPr>
+            <w:r>
+              <w:rPr>
+                <w:lang w:eastAsia="zh-CN"/>
+              </w:rPr>
+              <w:t>系统管理员</w:t>
+            </w:r>
+          </w:p>
+        </w:tc>
+      </w:tr>
+      <w:tr>
+        <w:tc>
+          <w:tcPr>
+            <w:tcW w:w="0" w:type="auto"/>
+            <w:hideMark/>
+          </w:tcPr>
+          <w:p>
+            <w:pPr>
+              <w:spacing w:after="200" w:line="276" w:lineRule="auto"/>
+              <w:rPr>
+                <w:lang w:eastAsia="zh-CN"/>
+              </w:rPr>
+            </w:pPr>
+            <w:r>
+              <w:rPr>
+                <w:lang w:eastAsia="zh-CN"/>
+              </w:rPr>
+              <w:t>计划</w:t>
+            </w:r>
+          </w:p>
+        </w:tc>
+        <w:tc>
+          <w:tcPr>
+            <w:tcW w:w="0" w:type="auto"/>
+            <w:hideMark/>
+          </w:tcPr>
+          <w:p>
+            <w:pPr>
+              <w:spacing w:after="200" w:line="276" w:lineRule="auto"/>
+              <w:rPr>
+                <w:lang w:eastAsia="zh-CN"/>
+              </w:rPr>
+            </w:pPr>
+            <w:r>
+              <w:rPr>
+                <w:lang w:eastAsia="zh-CN"/>
+              </w:rPr>
+              <w:t>根据某个农场的模板版本、统一定植日期，为该农场每个地块生成的实际任务清单</w:t>
+            </w:r>
+          </w:p>
+        </w:tc>
+        <w:tc>
+          <w:tcPr>
+            <w:tcW w:w="0" w:type="auto"/>
+            <w:hideMark/>
+          </w:tcPr>
+          <w:p>
+            <w:pPr>
+              <w:spacing w:after="200" w:line="276" w:lineRule="auto"/>
+              <w:rPr>
+                <w:lang w:eastAsia="zh-CN"/>
+              </w:rPr>
+            </w:pPr>
+            <w:r>
+              <w:rPr>
+                <w:lang w:eastAsia="zh-CN"/>
+              </w:rPr>
+              <w:t>系统管理员一键生成</w:t>
+            </w:r>
+          </w:p>
+        </w:tc>
+      </w:tr>
+    </w:tbl>
+    <w:p>
+      <w:pPr>
+        <w:rPr>
+          <w:lang w:eastAsia="zh-CN"/>
+        </w:rPr>
+      </w:pPr>
+    </w:p>
+    <w:p>
+      <w:pPr>
+        <w:rPr>
+          <w:lang w:eastAsia="zh-CN"/>
+        </w:rPr>
+      </w:pPr>
+    </w:p>
+    <w:tbl>
+      <w:tblPr>
+        <w:tblStyle w:val="aff1"/>
+        <w:tblW w:w="0" w:type="auto"/>
+        <w:tblLook w:val="04A0" w:firstRow="1" w:lastRow="0" w:firstColumn="1" w:lastColumn="0" w:noHBand="0" w:noVBand="1"/>
+      </w:tblPr>
+      <w:tblGrid>
+        <w:gridCol w:w="1187"/>
+        <w:gridCol w:w="8821"/>
+      </w:tblGrid>
+      <w:tr>
+        <w:tc>
+          <w:tcPr>
+            <w:tcW w:w="0" w:type="auto"/>
+            <w:hideMark/>
+          </w:tcPr>
+          <w:p>
+            <w:pPr>
+              <w:spacing w:after="200" w:line="276" w:lineRule="auto"/>
+              <w:rPr>
+                <w:b/>
+                <w:bCs/>
+                <w:lang w:eastAsia="zh-CN"/>
+              </w:rPr>
+            </w:pPr>
+            <w:r>
+              <w:rPr>
+                <w:b/>
+                <w:bCs/>
+                <w:lang w:eastAsia="zh-CN"/>
+              </w:rPr>
+              <w:t>角色</w:t>
+            </w:r>
+          </w:p>
+        </w:tc>
+        <w:tc>
+          <w:tcPr>
+            <w:tcW w:w="0" w:type="auto"/>
+            <w:hideMark/>
+          </w:tcPr>
+          <w:p>
+            <w:pPr>
+              <w:spacing w:after="200" w:line="276" w:lineRule="auto"/>
+              <w:rPr>
+                <w:b/>
+                <w:bCs/>
+                <w:lang w:eastAsia="zh-CN"/>
+              </w:rPr>
+            </w:pPr>
+            <w:r>
+              <w:rPr>
+                <w:b/>
+                <w:bCs/>
+                <w:lang w:eastAsia="zh-CN"/>
+              </w:rPr>
+              <w:t>负责什么</w:t>
+            </w:r>
+          </w:p>
+        </w:tc>
+      </w:tr>
+      <w:tr>
+        <w:tc>
+          <w:tcPr>
+            <w:tcW w:w="0" w:type="auto"/>
+            <w:hideMark/>
+          </w:tcPr>
+          <w:p>
+            <w:pPr>
+              <w:spacing w:after="200" w:line="276" w:lineRule="auto"/>
+              <w:rPr>
+                <w:lang w:eastAsia="zh-CN"/>
+              </w:rPr>
+            </w:pPr>
+            <w:r>
+              <w:rPr>
+                <w:lang w:eastAsia="zh-CN"/>
+              </w:rPr>
+              <w:t>系统管理</w:t>
+            </w:r>
+            <w:r>
+              <w:rPr>
+                <w:lang w:eastAsia="zh-CN"/>
+              </w:rPr>
+              <w:lastRenderedPageBreak/>
+              <w:t>员</w:t>
+            </w:r>
+          </w:p>
+        </w:tc>
+        <w:tc>
+          <w:tcPr>
+            <w:tcW w:w="0" w:type="auto"/>
+            <w:hideMark/>
+          </w:tcPr>
+          <w:p>
+            <w:pPr>
+              <w:spacing w:after="200" w:line="276" w:lineRule="auto"/>
+              <w:rPr>
+                <w:lang w:eastAsia="zh-CN"/>
+              </w:rPr>
+            </w:pPr>
+            <w:r>
+              <w:rPr>
+                <w:lang w:eastAsia="zh-CN"/>
+              </w:rPr>
+              <w:lastRenderedPageBreak/>
+              <w:t>员工账号、农场和地块基础档案、授权范围；维护“标准模板库”</w:t>
+            </w:r>
+          </w:p>
+        </w:tc>
+      </w:tr>
+      <w:tr>
+        <w:tc>
+          <w:tcPr>
+            <w:tcW w:w="0" w:type="auto"/>
+            <w:hideMark/>
+          </w:tcPr>
+          <w:p>
+            <w:pPr>
+              <w:spacing w:after="200" w:line="276" w:lineRule="auto"/>
+              <w:rPr>
+                <w:lang w:eastAsia="zh-CN"/>
+              </w:rPr>
+            </w:pPr>
+            <w:r>
+              <w:rPr>
+                <w:lang w:eastAsia="zh-CN"/>
+              </w:rPr>
+              <w:t>农场管理员</w:t>
+            </w:r>
+          </w:p>
+        </w:tc>
+        <w:tc>
+          <w:tcPr>
+            <w:tcW w:w="0" w:type="auto"/>
+            <w:hideMark/>
+          </w:tcPr>
+          <w:p>
+            <w:pPr>
+              <w:spacing w:after="200" w:line="276" w:lineRule="auto"/>
+              <w:rPr>
+                <w:lang w:eastAsia="zh-CN"/>
+              </w:rPr>
+            </w:pPr>
+            <w:r>
+              <w:rPr>
+                <w:lang w:eastAsia="zh-CN"/>
+              </w:rPr>
+              <w:t>结合本农场实际情况，选择标准模板、维护本农场生产周期、修改下一周期作业方案、生成本农场计划</w:t>
+            </w:r>
+          </w:p>
+        </w:tc>
+      </w:tr>
+      <w:tr>
+        <w:tc>
+          <w:tcPr>
+            <w:tcW w:w="0" w:type="auto"/>
+            <w:hideMark/>
+          </w:tcPr>
+          <w:p>
+            <w:pPr>
+              <w:spacing w:after="200" w:line="276" w:lineRule="auto"/>
+              <w:rPr>
+                <w:lang w:eastAsia="zh-CN"/>
+              </w:rPr>
+            </w:pPr>
+            <w:r>
+              <w:rPr>
+                <w:lang w:eastAsia="zh-CN"/>
+              </w:rPr>
+              <w:t>农户</w:t>
+            </w:r>
+          </w:p>
+        </w:tc>
+        <w:tc>
+          <w:tcPr>
+            <w:tcW w:w="0" w:type="auto"/>
+            <w:hideMark/>
+          </w:tcPr>
+          <w:p>
+            <w:pPr>
+              <w:spacing w:after="200" w:line="276" w:lineRule="auto"/>
+              <w:rPr>
+                <w:lang w:eastAsia="zh-CN"/>
+              </w:rPr>
+            </w:pPr>
+            <w:r>
+              <w:rPr>
+                <w:lang w:eastAsia="zh-CN"/>
+              </w:rPr>
+              <w:t>执行自己地块的任务，调整日期/备注/状态，登记完成和计划外农事</w:t>
+            </w:r>
+          </w:p>
+        </w:tc>
+      </w:tr>
+    </w:tbl>
+    <w:p>
+      <w:pPr>
+        <w:rPr>
+          <w:lang w:eastAsia="zh-CN"/>
+        </w:rPr>
+      </w:pPr>
+    </w:p>
+    <w:p>
+      <w:pPr>
+        <w:rPr>
+          <w:lang w:eastAsia="zh-CN"/>
+        </w:rPr>
+      </w:pPr>
+      <w:r>
+        <w:rPr>
+          <w:lang w:eastAsia="zh-CN"/>
+        </w:rPr>
+        <w:t>同时把名称区分清楚：</w:t>
+      </w:r>
+    </w:p>
+    <w:p>
+      <w:pPr>
+        <w:numPr>
+          <w:ilvl w:val="0"/>
+          <w:numId w:val="12"/>
+        </w:numPr>
+        <w:rPr>
+          <w:lang w:eastAsia="zh-CN"/>
+        </w:rPr>
+      </w:pPr>
+      <w:r>
+        <w:rPr>
+          <w:lang w:eastAsia="zh-CN"/>
+        </w:rPr>
+        <w:t>标准模板：平台级的通用脐橙管理规范，由系统管理员维护。</w:t>
+      </w:r>
+    </w:p>
+    <w:p>
+      <w:pPr>
+        <w:numPr>
+          <w:ilvl w:val="0"/>
+          <w:numId w:val="12"/>
+        </w:numPr>
+        <w:rPr>
+          <w:lang w:eastAsia="zh-CN"/>
+        </w:rPr>
+      </w:pPr>
+      <w:r>
+        <w:rPr>
+          <w:lang w:eastAsia="zh-CN"/>
+        </w:rPr>
+        <w:t>农场周期版本：农场管理员基于标准模板，为自己农场下一周期调整后的版本。</w:t>
+      </w:r>
+    </w:p>
+    <w:p>
+      <w:pPr>
+        <w:numPr>
+          <w:ilvl w:val="0"/>
+          <w:numId w:val="12"/>
+        </w:numPr>
+        <w:rPr>
+          <w:lang w:eastAsia="zh-CN"/>
+        </w:rPr>
+      </w:pPr>
+      <w:r>
+        <w:rPr>
+          <w:lang w:eastAsia="zh-CN"/>
+        </w:rPr>
+        <w:t>草稿：农场管理员在采收清园后，为下一周期修改的“农场周期版本”。</w:t>
+      </w:r>
+    </w:p>
+    <w:p>
+      <w:pPr>
+        <w:numPr>
+          <w:ilvl w:val="0"/>
+          <w:numId w:val="12"/>
+        </w:numPr>
+        <w:rPr>
+          <w:lang w:eastAsia="zh-CN"/>
+        </w:rPr>
+      </w:pPr>
+      <w:r>
+        <w:rPr>
+          <w:lang w:eastAsia="zh-CN"/>
+        </w:rPr>
+        <w:t>计划：系统根据农场管理员确认的周期版本和统一定植日期，为各地块生成的任务清单。</w:t>
+      </w:r>
+    </w:p>
+    <w:p>
+      <w:pPr>
+        <w:rPr>
           <w:rFonts w:hint="eastAsia"/>
           <w:lang w:eastAsia="zh-CN"/>
         </w:rPr>
@@ -7957,6 +8540,155 @@
       </w:rPr>
     </w:lvl>
   </w:abstractNum>
+  <w:abstractNum w:abstractNumId="11" w15:restartNumberingAfterBreak="0">
+    <w:nsid w:val="5EFD56F1"/>
+    <w:multiLevelType w:val="multilevel"/>
+    <w:tmpl w:val="514C3708"/>
+    <w:lvl w:ilvl="0">
+      <w:start w:val="1"/>
+      <w:numFmt w:val="bullet"/>
+      <w:lvlText w:val=""/>
+      <w:lvlJc w:val="left"/>
+      <w:pPr>
+        <w:tabs>
+          <w:tab w:val="num" w:pos="720"/>
+        </w:tabs>
+        <w:ind w:left="720" w:hanging="360"/>
+      </w:pPr>
+      <w:rPr>
+        <w:rFonts w:ascii="Symbol" w:hAnsi="Symbol" w:hint="default"/>
+        <w:sz w:val="20"/>
+      </w:rPr>
+    </w:lvl>
+    <w:lvl w:ilvl="1" w:tentative="1">
+      <w:start w:val="1"/>
+      <w:numFmt w:val="bullet"/>
+      <w:lvlText w:val="o"/>
+      <w:lvlJc w:val="left"/>
+      <w:pPr>
+        <w:tabs>
+          <w:tab w:val="num" w:pos="1440"/>
+        </w:tabs>
+        <w:ind w:left="1440" w:hanging="360"/>
+      </w:pPr>
+      <w:rPr>
+        <w:rFonts w:ascii="Courier New" w:hAnsi="Courier New" w:hint="default"/>
+        <w:sz w:val="20"/>
+      </w:rPr>
+    </w:lvl>
+    <w:lvl w:ilvl="2" w:tentative="1">
+      <w:start w:val="1"/>
+      <w:numFmt w:val="bullet"/>
+      <w:lvlText w:val=""/>
+      <w:lvlJc w:val="left"/>
+      <w:pPr>
+        <w:tabs>
+          <w:tab w:val="num" w:pos="2160"/>
+        </w:tabs>
+        <w:ind w:left="2160" w:hanging="360"/>
+      </w:pPr>
+      <w:rPr>
+        <w:rFonts w:ascii="Wingdings" w:hAnsi="Wingdings" w:hint="default"/>
+        <w:sz w:val="20"/>
+      </w:rPr>
+    </w:lvl>
+    <w:lvl w:ilvl="3" w:tentative="1">
+      <w:start w:val="1"/>
+      <w:numFmt w:val="bullet"/>
+      <w:lvlText w:val=""/>
+      <w:lvlJc w:val="left"/>
+      <w:pPr>
+        <w:tabs>
+          <w:tab w:val="num" w:pos="2880"/>
+        </w:tabs>
+        <w:ind w:left="2880" w:hanging="360"/>
+      </w:pPr>
+      <w:rPr>
+        <w:rFonts w:ascii="Wingdings" w:hAnsi="Wingdings" w:hint="default"/>
+        <w:sz w:val="20"/>
+      </w:rPr>
+    </w:lvl>
+    <w:lvl w:ilvl="4" w:tentative="1">
+      <w:start w:val="1"/>
+      <w:numFmt w:val="bullet"/>
+      <w:lvlText w:val=""/>
+      <w:lvlJc w:val="left"/>
+      <w:pPr>
+        <w:tabs>
+          <w:tab w:val="num" w:pos="3600"/>
+        </w:tabs>
+        <w:ind w:left="3600" w:hanging="360"/>
+      </w:pPr>
+      <w:rPr>
+        <w:rFonts w:ascii="Wingdings" w:hAnsi="Wingdings" w:hint="default"/>
+        <w:sz w:val="20"/>
+      </w:rPr>
+    </w:lvl>
+    <w:lvl w:ilvl="5" w:tentative="1">
+      <w:start w:val="1"/>
+      <w:numFmt w:val="bullet"/>
+      <w:lvlText w:val=""/>
+      <w:lvlJc w:val="left"/>
+      <w:pPr>
+        <w:tabs>
+          <w:tab w:val="num" w:pos="4320"/>
+        </w:tabs>
+        <w:ind w:left="4320" w:hanging="360"/>
+      </w:pPr>
+      <w:rPr>
+        <w:rFonts w:ascii="Wingdings" w:hAnsi="Wingdings" w:hint="default"/>
+        <w:sz w:val="20"/>
+      </w:rPr>
+    </w:lvl>
+    <w:lvl w:ilvl="6" w:tentative="1">
+      <w:start w:val="1"/>
+      <w:numFmt w:val="bullet"/>
+      <w:lvlText w:val=""/>
+      <w:lvlJc w:val="left"/>
+      <w:pPr>
+        <w:tabs>
+          <w:tab w:val="num" w:pos="5040"/>
+        </w:tabs>
+        <w:ind w:left="5040" w:hanging="360"/>
+      </w:pPr>
+      <w:rPr>
+        <w:rFonts w:ascii="Wingdings" w:hAnsi="Wingdings" w:hint="default"/>
+        <w:sz w:val="20"/>
+      </w:rPr>
+    </w:lvl>
+    <w:lvl w:ilvl="7" w:tentative="1">
+      <w:start w:val="1"/>
+      <w:numFmt w:val="bullet"/>
+      <w:lvlText w:val=""/>
+      <w:lvlJc w:val="left"/>
+      <w:pPr>
+        <w:tabs>
+          <w:tab w:val="num" w:pos="5760"/>
+        </w:tabs>
+        <w:ind w:left="5760" w:hanging="360"/>
+      </w:pPr>
+      <w:rPr>
+        <w:rFonts w:ascii="Wingdings" w:hAnsi="Wingdings" w:hint="default"/>
+        <w:sz w:val="20"/>
+      </w:rPr>
+    </w:lvl>
+    <w:lvl w:ilvl="8" w:tentative="1">
+      <w:start w:val="1"/>
+      <w:numFmt w:val="bullet"/>
+      <w:lvlText w:val=""/>
+      <w:lvlJc w:val="left"/>
+      <w:pPr>
+        <w:tabs>
+          <w:tab w:val="num" w:pos="6480"/>
+        </w:tabs>
+        <w:ind w:left="6480" w:hanging="360"/>
+      </w:pPr>
+      <w:rPr>
+        <w:rFonts w:ascii="Wingdings" w:hAnsi="Wingdings" w:hint="default"/>
+        <w:sz w:val="20"/>
+      </w:rPr>
+    </w:lvl>
+  </w:abstractNum>
   <w:num w:numId="1" w16cid:durableId="1366712381">
     <w:abstractNumId w:val="8"/>
   </w:num>
@@ -7989,6 +8721,9 @@
   </w:num>
   <w:num w:numId="11" w16cid:durableId="700396078">
     <w:abstractNumId w:val="9"/>
+  </w:num>
+  <w:num w:numId="12" w16cid:durableId="1449540797">
+    <w:abstractNumId w:val="11"/>
   </w:num>
 </w:numbering>
 </file>

</xml_diff>